<commit_message>
Frame attention as a possible by-product of prequestions in the Introduction
Co-Authored-By: Claude Opus 5.5 <noreply@anthropic.com>
</commit_message>
<xml_diff>
--- a/manuscript/manuscript.docx
+++ b/manuscript/manuscript.docx
@@ -1078,7 +1078,7 @@
         <w:pStyle w:val="BodyText"/>
       </w:pPr>
       <w:r>
-        <w:t xml:space="preserve">Whether attention is the main mechanism is not settled, however. Pretesting has been found to reduce mind-wandering during online lectures</w:t>
+        <w:t xml:space="preserve">Attention, however, may be a by-product of prequestions rather than what directly produces their benefit, because several findings show that prequestions can improve learning without a corresponding increase in attention to the material. Pretesting has been found to reduce mind-wandering during online lectures</w:t>
       </w:r>
       <w:r>
         <w:t xml:space="preserve"> </w:t>
@@ -1118,7 +1118,7 @@
         <w:t xml:space="preserve">)</w:t>
       </w:r>
       <w:r>
-        <w:t xml:space="preserve">. In a large multi-site classroom study, prequestions before online lecture videos improved learning even though students did not watch more of the videos afterwards</w:t>
+        <w:t xml:space="preserve">, so less mind-wandering did not translate into better learning. In a large multi-site classroom study, prequestions before online lecture videos improved learning even though students did not watch more of the videos afterwards</w:t>
       </w:r>
       <w:r>
         <w:t xml:space="preserve"> </w:t>
@@ -1138,7 +1138,47 @@
         <w:t xml:space="preserve">)</w:t>
       </w:r>
       <w:r>
-        <w:t xml:space="preserve">, suggesting that prequestions can improve learning without increasing the time spent on the material.</w:t>
+        <w:t xml:space="preserve">. In the eye-tracking studies reviewed above, prequestions did not slow forward reading of the prequestioned sentences; instead, readers re-read them and looked back to them</w:t>
+      </w:r>
+      <w:r>
+        <w:t xml:space="preserve"> </w:t>
+      </w:r>
+      <w:r>
+        <w:t xml:space="preserve">(</w:t>
+      </w:r>
+      <w:hyperlink w:anchor="ref-lewis2012">
+        <w:r>
+          <w:rPr>
+            <w:rStyle w:val="Hyperlink"/>
+          </w:rPr>
+          <w:t xml:space="preserve">Lewis &amp; Mensink, 2012</w:t>
+        </w:r>
+      </w:hyperlink>
+      <w:r>
+        <w:t xml:space="preserve">)</w:t>
+      </w:r>
+      <w:r>
+        <w:t xml:space="preserve">, and integrative prequestions improved memory for non-prequestioned information even though readers spent less time on it</w:t>
+      </w:r>
+      <w:r>
+        <w:t xml:space="preserve"> </w:t>
+      </w:r>
+      <w:r>
+        <w:t xml:space="preserve">(</w:t>
+      </w:r>
+      <w:hyperlink w:anchor="ref-bostan2026">
+        <w:r>
+          <w:rPr>
+            <w:rStyle w:val="Hyperlink"/>
+          </w:rPr>
+          <w:t xml:space="preserve">Bostan &amp; Ozcelik, 2026</w:t>
+        </w:r>
+      </w:hyperlink>
+      <w:r>
+        <w:t xml:space="preserve">)</w:t>
+      </w:r>
+      <w:r>
+        <w:t xml:space="preserve">. To account for findings like these,</w:t>
       </w:r>
       <w:r>
         <w:t xml:space="preserve"> </w:t>
@@ -1161,7 +1201,7 @@
         <w:t xml:space="preserve"> </w:t>
       </w:r>
       <w:r>
-        <w:t xml:space="preserve">proposed instead a</w:t>
+        <w:t xml:space="preserve">proposed the</w:t>
       </w:r>
       <w:r>
         <w:t xml:space="preserve"> </w:t>
@@ -1174,7 +1214,7 @@
         <w:t xml:space="preserve">mental model hypothesis</w:t>
       </w:r>
       <w:r>
-        <w:t xml:space="preserve">: prequestions activate relevant knowledge before learning, which then facilitates the processing and encoding of related information. On this view, attention effects follow from the activated knowledge: when learners encounter content related to the prequestions, it resonates with the activated knowledge, and once they recognize it as related, they may direct additional attention to it.</w:t>
+        <w:t xml:space="preserve">: prequestions activate relevant knowledge before learning, which then facilitates the processing and encoding of related information. When learners encounter content related to the prequestions, it resonates with the activated knowledge, and once they recognize it as related, they may direct additional attention to it. On this view, attention follows recognition of related content rather than directly causing the benefit.</w:t>
       </w:r>
     </w:p>
     <w:bookmarkStart w:id="27" w:name="the-current-study"/>

</xml_diff>

<commit_message>
Use here() for all paths, add rater-agreement step, retitle paper
- All scripts and the manuscript build paths with here::here() from the
  project root (.here), so they run from any working directory
- Add the analysis helpers, manuscript inputs, second-rater scoring and
  agreement scripts, model export/split scripts, and the power analysis
- Pipeline: second-rater agreement as step 6; manuscript is step 7
- Remove unused files (earlier Tobii export, earlier sentence lists)
- Manuscript: new title, no general benefit wording, limitations
  trimmed; README updated (sample of 138, rater check, here)

Co-Authored-By: Claude Opus 5.5 <noreply@anthropic.com>
</commit_message>
<xml_diff>
--- a/manuscript/manuscript.docx
+++ b/manuscript/manuscript.docx
@@ -24,7 +24,7 @@
         <w:pStyle w:val="Heading1"/>
       </w:pPr>
       <w:r>
-        <w:t xml:space="preserve">Pausing on the Answers: How Prequestions Guide Attention During Reading</w:t>
+        <w:t xml:space="preserve">I Remember That Question: How Prequestions Shape Reading</w:t>
       </w:r>
     </w:p>
     <w:p>
@@ -149,7 +149,7 @@
         <w:pStyle w:val="AbstractFirstParagraph"/>
       </w:pPr>
       <w:r>
-        <w:t xml:space="preserve">Answering questions before a learning episode (prequestions) improves memory for the information the questions address, but why it does so is not well understood. One proposal is that prequestions guide attention toward the information they address. We tested this selective-attention account by recording eye movements while participants read a passage about efforts to eradicate polio and tuberculosis (TB). Before reading, participants answered prequestions about polio, prequestions about TB, or no prequestions; afterwards, all participants took a short-answer test on both topics. Prequestions produced a specific memory benefit—better memory than the no-prequestion condition for the prequestioned topic—and a small general cost for the non-prequestioned topic, for which the Bayes factor was inconclusive. Compared with the same sentences read without prequestions, sentences that answered a reader’s prequestions received more occasional unusually long readings, were re-read more, and were more likely to be looked back to later, whereas typical reading time did not change. Non-prequestioned sentences were read largely as they were without prequestions. Prequestions thus guide attention selectively, but heightened attention is not the whole story: rather than slowing reading of the relevant material overall, they lead readers to pause on the answers and return to them, consistent with additional processing when readers recognize an answer to their prequestions.</w:t>
+        <w:t xml:space="preserve">Answering questions before a learning episode (prequestions) improves memory for the information the questions address, but why it does so is not well understood. One proposal is that prequestions guide attention toward the information they address. We tested this selective-attention account by recording eye movements while participants read a passage about efforts to eradicate polio and tuberculosis (TB). Before reading, participants answered prequestions about polio, prequestions about TB, or no prequestions; afterwards, all participants took a short-answer test on both topics. Prequestions produced a specific memory benefit—better memory than the no-prequestion condition for the prequestioned topic—but no general benefit for the non-prequestioned topic. Compared with the same sentences read without prequestions, sentences that answered a reader’s prequestions received more occasional unusually long readings, were re-read more, and were more likely to be looked back to later, whereas typical reading time did not change. Non-prequestioned sentences were read largely as they were without prequestions. Prequestions thus guide attention selectively, but heightened attention is not the whole story: rather than slowing reading of the relevant material overall, they lead readers to pause on the answers and return to them, consistent with additional processing when readers recognize an answer to their prequestions.</w:t>
       </w:r>
     </w:p>
     <w:p>
@@ -179,7 +179,7 @@
         <w:pStyle w:val="Heading1"/>
       </w:pPr>
       <w:r>
-        <w:t xml:space="preserve">Pausing on the Answers: How Prequestions Guide Attention During Reading</w:t>
+        <w:t xml:space="preserve">I Remember That Question: How Prequestions Shape Reading</w:t>
       </w:r>
     </w:p>
     <w:p>
@@ -4111,7 +4111,7 @@
         <w:t xml:space="preserve">5</w:t>
       </w:r>
       <w:r>
-        <w:t xml:space="preserve">: extreme evidence for a difference. On the non-prequestioned topic they earned 41.0%, slightly less than the no-prequestion condition, -4.5 percentage points, 95% CrI [-8.9, -0.2], pd = 98.0%, BF</w:t>
+        <w:t xml:space="preserve">: extreme evidence for a difference. On the non-prequestioned topic they earned 41.0%, numerically slightly lower than in the no-prequestion condition, -4.5 percentage points, 95% CrI [-8.9, -0.2], pd = 98.0%, BF</w:t>
       </w:r>
       <w:r>
         <w:rPr>
@@ -4123,7 +4123,7 @@
         <w:t xml:space="preserve"> </w:t>
       </w:r>
       <w:r>
-        <w:t xml:space="preserve">= 1.93. By the preregistered criterion (pd &gt; 97.5%), this is a general effect, but a small cost rather than a benefit, and the Bayes factor was inconclusive, providing only anecdotal evidence for no difference.</w:t>
+        <w:t xml:space="preserve">= 1.93. There was therefore no general benefit. Although the difference met the preregistered criterion (pd &gt; 97.5%) in the direction of a cost, the Bayes factor was inconclusive, providing only anecdotal evidence for no difference, so we do not interpret it as a general cost.</w:t>
       </w:r>
     </w:p>
     <w:p>
@@ -5399,7 +5399,7 @@
         <w:pStyle w:val="FirstParagraph"/>
       </w:pPr>
       <w:r>
-        <w:t xml:space="preserve">This study used eye tracking to test whether prequestions improve memory by directing attention toward the information they address. Two sets of preregistered comparisons addressed this question. Pooling the two prequestion groups, we compared each target sentence and question when it answered the reader’s prequestions with the same sentence or question for readers who saw no prequestions (the specific effect), and the other topic’s material with the same material without prequestions (the general effect). The Group × Topic comparisons then asked whether the effects reversed with the prequestioned topic, that is, whether the Polio group favoured Polio material and the TB group TB material. On the final test, prequestions produced the typical specific benefit and a small general cost on the non-prequestioned topic, for which the Bayes factor was inconclusive, and the crossover was clear: each prequestion group did relatively better on its own topic (interaction contrast, extreme evidence). Eye movements showed the same specificity. Compared with the same sentences read without prequestions, prequestioned sentences received more unusually long readings, were re-read more often, and were more likely to be looked back to from later text, whereas non-prequestioned sentences were read like the same sentences in the no-prequestion condition on every measure. In the Group × Topic comparisons, the interaction contrast was positive (pd &gt; 95%) for the tail of unusually long readings (τ), look-backs from later text, and first-pass reading; and not reliably positive for typical reading time (μ) and re-reading time (</w:t>
+        <w:t xml:space="preserve">This study used eye tracking to test whether prequestions improve memory by directing attention toward the information they address. Two sets of preregistered comparisons addressed this question. Pooling the two prequestion groups, we compared each target sentence and question when it answered the reader’s prequestions with the same sentence or question for readers who saw no prequestions (the specific effect), and the other topic’s material with the same material without prequestions (the general effect). The Group × Topic comparisons then asked whether the effects reversed with the prequestioned topic, that is, whether the Polio group favoured Polio material and the TB group TB material. On the final test, prequestions produced the typical specific benefit and no general benefit, and the crossover was clear: each prequestion group did relatively better on its own topic (interaction contrast, extreme evidence). Eye movements showed the same specificity. Compared with the same sentences read without prequestions, prequestioned sentences received more unusually long readings, were re-read more often, and were more likely to be looked back to from later text, whereas non-prequestioned sentences were read like the same sentences in the no-prequestion condition on every measure. In the Group × Topic comparisons, the interaction contrast was positive (pd &gt; 95%) for the tail of unusually long readings (τ), look-backs from later text, and first-pass reading; and not reliably positive for typical reading time (μ) and re-reading time (</w:t>
       </w:r>
       <w:hyperlink w:anchor="fig-eye">
         <w:r>
@@ -5696,7 +5696,7 @@
         <w:t xml:space="preserve"> </w:t>
       </w:r>
       <w:r>
-        <w:t xml:space="preserve">found no general benefit, and also no general cost, which suggests that if prequestions orient attention toward the prequestioned information, this orienting does not impede learning of other information. The eye movements here fit this view: non-prequestioned sentences were read as they were without prequestions on every measure, so prequestions changed how readers treated their answers, not how they read the topic or the passage as a whole. The cost on the non-prequestioned topic in the final test is therefore unlikely to reflect attention diverted from that material during reading; it may instead arise at encoding or retrieval, for example from interference by the prequestioned topic.</w:t>
+        <w:t xml:space="preserve">found no general benefit, and also no general cost, which suggests that if prequestions orient attention toward the prequestioned information, this orienting does not impede learning of other information. The eye movements here fit this view: non-prequestioned sentences were read as they were without prequestions on every measure, so prequestions changed how readers treated their answers, not how they read the topic or the passage as a whole.</w:t>
       </w:r>
     </w:p>
     <w:p>
@@ -5818,19 +5818,7 @@
         <w:t xml:space="preserve">)</w:t>
       </w:r>
       <w:r>
-        <w:t xml:space="preserve">. In the present study, prequestions about single facts neither increased attention to non-prequestioned information nor improved memory for it. Memory for the non-prequestioned material was, if anything, slightly worse than in the no-prequestion condition (-4.5 percentage points, 95% CrI [-8.9, -0.2], pd = 98.0%, BF</w:t>
-      </w:r>
-      <w:r>
-        <w:rPr>
-          <w:vertAlign w:val="subscript"/>
-        </w:rPr>
-        <w:t xml:space="preserve">01</w:t>
-      </w:r>
-      <w:r>
-        <w:t xml:space="preserve"> </w:t>
-      </w:r>
-      <w:r>
-        <w:t xml:space="preserve">= 1.93). This difference was not reliable, and the Bayes factor did not favour it, but it is consistent with a trade-off in which prequestions draw attention and encoding toward the prequestioned topic at the expense of the rest of the text. Testing this possibility would require more questions per topic. With 12 participants per group, however, the estimates of</w:t>
+        <w:t xml:space="preserve">. In the present study, prequestions about single facts neither increased attention to non-prequestioned information nor improved memory for it. With 12 participants per group, however, the estimates of</w:t>
       </w:r>
       <w:r>
         <w:t xml:space="preserve"> </w:t>
@@ -5861,7 +5849,7 @@
         <w:pStyle w:val="BodyText"/>
       </w:pPr>
       <w:r>
-        <w:t xml:space="preserve">Several limitations should be noted. Each topic was represented by only five target sentences and five test questions. The within-group Polio − TB differences therefore combine any effect of prequestions with differences between the materials: the Polio and TB sentences differed in length, content, reading level, and position on the page, and the no-prequestion group read them differently even without prequestions. The Group × Topic interaction contrasts remove these differences, but they compare two groups of readers and rest on five items per topic. We therefore based our conclusions primarily on the pooled comparisons, which compare the same sentences and questions with and without prequestions, so that differences between the materials cancel out, and we treat the Group × Topic contrasts as converging evidence where they were reliable. Texts with more target sentences per topic would allow topic-specific effects to be estimated precisely. The comparisons with the no-prequestion condition are between participants, and so are less precise than comparisons within readers. The Bayes factors depend on the priors on the effects: wider priors favour the absence of an effect more strongly, and narrower priors less so. They show that the data are better described without a general effect than with an effect of the size the priors allow, not that a small general effect is impossible. Eye movements were recorded without head stabilization, and recorded gaze positions drifted vertically for some readers. The measures were therefore derived from the fixation data with a drift correction bounded by the calibration accuracy criterion; drift beyond that bound was not corrected. Finally, responses were scored with an automated rubric, and the sample came from a single university.</w:t>
+        <w:t xml:space="preserve">Several limitations should be noted. Each topic was represented by only five target sentences and five test questions. The within-group Polio − TB differences therefore combine any effect of prequestions with differences between the materials: the Polio and TB sentences differed in length, content, reading level, and position on the page, and the no-prequestion group read them differently even without prequestions. The Group × Topic interaction contrasts remove these differences, but they compare two groups of readers and rest on five items per topic. We therefore based our conclusions primarily on the pooled comparisons, which compare the same sentences and questions with and without prequestions, so that differences between the materials cancel out, and we treat the Group × Topic contrasts as converging evidence where they were reliable. Texts with more target sentences per topic would allow topic-specific effects to be estimated precisely. The comparisons with the no-prequestion condition are between participants, and so are less precise than comparisons within readers. The Bayes factors depend on the priors on the effects: wider priors favour the absence of an effect more strongly, and narrower priors less so. They show that the data are better described without a general effect than with an effect of the size the priors allow, not that a small general effect is impossible. Eye movements were recorded without head stabilization, and recorded gaze positions drifted vertically for some readers. The measures were therefore derived from the fixation data with a drift correction bounded by the calibration accuracy criterion; drift beyond that bound was not corrected.</w:t>
       </w:r>
     </w:p>
     <w:p>

</xml_diff>

<commit_message>
Add Bayes factor prior-width sensitivity (Appendix E); TB-only Lewis comparison
- Every effect prior halved and doubled; Bayes factors in Appendix E, with a
  claims-checked sentence in the Limitations
- Comparison with Lewis & Mensink (2012) restricted to the TB material
- README: how to run scripts/bf_sensitivity.R

Co-Authored-By: Claude Opus 5.5 <noreply@anthropic.com>
</commit_message>
<xml_diff>
--- a/manuscript/manuscript.docx
+++ b/manuscript/manuscript.docx
@@ -6444,7 +6444,7 @@
         <w:t xml:space="preserve">)</w:t>
       </w:r>
       <w:r>
-        <w:t xml:space="preserve">, TB prequestions improved memory for the TB information (11.8 percentage points, 95% CrI [5.3, 17.9]) but not for the Polio information, which was, if anything, remembered slightly worse (−5.8 percentage points, 95% CrI [−11.6, −0.1]), and increased looking back to the TB sentences from later text (10.0 percentage points, 95% CrI [3.0, 16.9]) and the time spent re-reading them (38.6 ms per word, 95% CrI [12.2, 67.1]). Unlike</w:t>
+        <w:t xml:space="preserve">, TB prequestions improved memory for the TB information (11.8 percentage points, 95% CrI [5.3, 17.9]) and increased looking back to the TB sentences from later text (10.0 percentage points, 95% CrI [3.0, 16.9]) and the time spent re-reading them (38.6 ms per word, 95% CrI [12.2, 67.1]). Unlike</w:t>
       </w:r>
       <w:r>
         <w:t xml:space="preserve"> </w:t>
@@ -6464,7 +6464,7 @@
         <w:t xml:space="preserve">)</w:t>
       </w:r>
       <w:r>
-        <w:t xml:space="preserve">, who found more re-inspection of the targeted sentences during first-pass reading and somewhat more looking back to the rest of the text, we found no reliable difference in first-pass reading of the TB sentences (μ: 6.2 ms per word, 95% CrI [−13.9, 26.9]; τ: 7.6 ms per word, 95% CrI [−19.6, 35.3]) and, if anything, fewer look-backs to the Polio sentences (−5.2 percentage points, 95% CrI [−11.7, 1.0]). Pooled over both prequestion groups, however, selective regression-path duration showed a longer tail but no shift in typical reading time, although with weak evidence. Separating μ from τ was important here: an analysis of means, as in previous studies, would dilute effects confined to a subset of readings and could not distinguish them from slower reading overall. The studies also differ in design and measures: the present study compared every target sentence with and without prequestions in a larger sample, measured re-reading as time on the sentence itself after the reader had moved on, and measured first-pass reading as selective regression-path duration</w:t>
+        <w:t xml:space="preserve">, who found more re-inspection of the targeted sentences during first-pass reading, we found no reliable difference in first-pass reading of the TB sentences (μ: 6.2 ms per word, 95% CrI [−13.9, 26.9]; τ: 7.6 ms per word, 95% CrI [−19.6, 35.3]). Pooled over both prequestion groups, however, selective regression-path duration showed a longer tail but no shift in typical reading time, although with weak evidence. Separating μ from τ was important here: an analysis of means, as in previous studies, would dilute effects confined to a subset of readings and could not distinguish them from slower reading overall. The studies also differ in design and measures: the present study compared every target sentence with and without prequestions in a larger sample, measured re-reading as time on the sentence itself after the reader had moved on, and measured first-pass reading as selective regression-path duration</w:t>
       </w:r>
       <w:r>
         <w:t xml:space="preserve"> </w:t>
@@ -6555,7 +6555,18 @@
         <w:t xml:space="preserve">)</w:t>
       </w:r>
       <w:r>
-        <w:t xml:space="preserve">, or varying which sentences serve as targets across versions of the text—and use more of them. The comparisons with the no-prequestion condition are between participants and so less precise than within-reader comparisons. The Bayes factors depend on the priors: they show that the data are better described without a general effect than with one of the size the priors allow, not that a small general effect is impossible. Finally, eye movements were recorded without head stabilization, and vertical drift was corrected only within the calibration accuracy criterion.</w:t>
+        <w:t xml:space="preserve">, or varying which sentences serve as targets across versions of the text—and use more of them. The comparisons with the no-prequestion condition are between participants and so less precise than within-reader comparisons. The Bayes factors depend on the priors: they show that the data are better described without a general effect than with one of the size the priors allow, not that a small general effect is impossible. Halving or doubling the width of every prior on the effects changed the strength of the evidence but not the conclusions (</w:t>
+      </w:r>
+      <w:hyperlink w:anchor="apx-e">
+        <w:r>
+          <w:rPr>
+            <w:rStyle w:val="Hyperlink"/>
+          </w:rPr>
+          <w:t xml:space="preserve">Appendix E</w:t>
+        </w:r>
+      </w:hyperlink>
+      <w:r>
+        <w:t xml:space="preserve">): every Bayes factor that provided at least moderate evidence for or against a difference stayed on the same side of 1, and only three Bayes factors that were anecdotal at the original width crossed 1. Finally, eye movements were recorded without head stabilization, and vertical drift was corrected only within the calibration accuracy criterion.</w:t>
       </w:r>
     </w:p>
     <w:p>
@@ -13669,10 +13680,1538 @@
         <w:t xml:space="preserve">) was fitted to fixations whose chain lay within half a line spacing of its line; gaze positions were corrected by inverting this model and the chains were reassigned, and this was repeated five times. The linear model was used only if it was plausible (a vertical stretch within 20% and a tilt of less than one line across the screen); otherwise the single offset was kept. Throughout, the correction was limited everywhere on the page to the calibration accuracy criterion of 0.5° (0.57 cm, about 0.45 of a line spacing), so it could not move a reader’s gaze by a whole line. Chains more than half a line spacing from every text line were treated as off the text.</w:t>
       </w:r>
     </w:p>
+    <w:p>
+      <w:r>
+        <w:br w:type="page"/>
+      </w:r>
+    </w:p>
+    <w:bookmarkEnd w:id="234"/>
+    <w:p>
+      <w:pPr>
+        <w:pStyle w:val="Heading1"/>
+      </w:pPr>
+      <w:r>
+        <w:t xml:space="preserve">Appendix E</w:t>
+      </w:r>
+    </w:p>
+    <w:bookmarkStart w:id="236" w:name="apx-e"/>
+    <w:p>
+      <w:pPr>
+        <w:pStyle w:val="Heading1"/>
+      </w:pPr>
+      <w:r>
+        <w:t xml:space="preserve">Bayes Factor Sensitivity to the Prior Width</w:t>
+      </w:r>
+    </w:p>
+    <w:bookmarkStart w:id="235" w:name="tbl-bf-sensitivity"/>
+    <w:p>
+      <w:pPr>
+        <w:pStyle w:val="FigureTitle"/>
+      </w:pPr>
+      <w:r>
+        <w:t xml:space="preserve">Table E1</w:t>
+      </w:r>
+    </w:p>
+    <w:p>
+      <w:pPr>
+        <w:pStyle w:val="Caption"/>
+      </w:pPr>
+      <w:r>
+        <w:t xml:space="preserve">Bayes Factors (BF</w:t>
+      </w:r>
+      <w:r>
+        <w:rPr>
+          <w:vertAlign w:val="subscript"/>
+        </w:rPr>
+        <w:t xml:space="preserve">10</w:t>
+      </w:r>
+      <w:r>
+        <w:t xml:space="preserve">) With the Priors on the Effects Halved, as in the Main Analysis, and Doubled</w:t>
+      </w:r>
+    </w:p>
+    <w:tbl>
+      <w:tblPr>
+        <w:tblStyle w:val="Table"/>
+        <w:tblW w:type="pct" w:w="5000"/>
+        <w:tblLayout w:type="fixed"/>
+        <w:tblLook w:firstRow="1" w:lastRow="0" w:firstColumn="0" w:lastColumn="0" w:noHBand="0" w:noVBand="0" w:val="0020"/>
+      </w:tblPr>
+      <w:tblGrid>
+        <w:gridCol w:w="2692"/>
+        <w:gridCol w:w="1425"/>
+        <w:gridCol w:w="1267"/>
+        <w:gridCol w:w="1267"/>
+        <w:gridCol w:w="1267"/>
+      </w:tblGrid>
+      <w:tr>
+        <w:trPr>
+          <w:tblHeader w:val="on"/>
+        </w:trPr>
+        <w:tc>
+          <w:tcPr/>
+          <w:p>
+            <w:pPr>
+              <w:pStyle w:val="Compact"/>
+              <w:jc w:val="left"/>
+            </w:pPr>
+            <w:r>
+              <w:t xml:space="preserve">Measure</w:t>
+            </w:r>
+          </w:p>
+        </w:tc>
+        <w:tc>
+          <w:tcPr/>
+          <w:p>
+            <w:pPr>
+              <w:pStyle w:val="Compact"/>
+              <w:jc w:val="left"/>
+            </w:pPr>
+            <w:r>
+              <w:t xml:space="preserve">Effect</w:t>
+            </w:r>
+          </w:p>
+        </w:tc>
+        <w:tc>
+          <w:tcPr/>
+          <w:p>
+            <w:pPr>
+              <w:pStyle w:val="Compact"/>
+              <w:jc w:val="left"/>
+            </w:pPr>
+            <w:r>
+              <w:t xml:space="preserve">× 0.5</w:t>
+            </w:r>
+          </w:p>
+        </w:tc>
+        <w:tc>
+          <w:tcPr/>
+          <w:p>
+            <w:pPr>
+              <w:pStyle w:val="Compact"/>
+              <w:jc w:val="left"/>
+            </w:pPr>
+            <w:r>
+              <w:t xml:space="preserve">× 1 (main)</w:t>
+            </w:r>
+          </w:p>
+        </w:tc>
+        <w:tc>
+          <w:tcPr/>
+          <w:p>
+            <w:pPr>
+              <w:pStyle w:val="Compact"/>
+              <w:jc w:val="left"/>
+            </w:pPr>
+            <w:r>
+              <w:t xml:space="preserve">× 2</w:t>
+            </w:r>
+          </w:p>
+        </w:tc>
+      </w:tr>
+      <w:tr>
+        <w:tc>
+          <w:tcPr/>
+          <w:p>
+            <w:pPr>
+              <w:pStyle w:val="Compact"/>
+              <w:jc w:val="left"/>
+            </w:pPr>
+            <w:r>
+              <w:t xml:space="preserve">Final test</w:t>
+            </w:r>
+          </w:p>
+        </w:tc>
+        <w:tc>
+          <w:tcPr/>
+          <w:p>
+            <w:pPr>
+              <w:pStyle w:val="Compact"/>
+              <w:jc w:val="left"/>
+            </w:pPr>
+            <w:r>
+              <w:t xml:space="preserve">Specific</w:t>
+            </w:r>
+          </w:p>
+        </w:tc>
+        <w:tc>
+          <w:tcPr/>
+          <w:p>
+            <w:pPr>
+              <w:pStyle w:val="Compact"/>
+              <w:jc w:val="left"/>
+            </w:pPr>
+            <w:r>
+              <w:t xml:space="preserve">1.4 × 10</w:t>
+            </w:r>
+            <w:r>
+              <w:rPr>
+                <w:vertAlign w:val="superscript"/>
+              </w:rPr>
+              <w:t xml:space="preserve">7</w:t>
+            </w:r>
+          </w:p>
+        </w:tc>
+        <w:tc>
+          <w:tcPr/>
+          <w:p>
+            <w:pPr>
+              <w:pStyle w:val="Compact"/>
+              <w:jc w:val="left"/>
+            </w:pPr>
+            <w:r>
+              <w:t xml:space="preserve">1.3 × 10</w:t>
+            </w:r>
+            <w:r>
+              <w:rPr>
+                <w:vertAlign w:val="superscript"/>
+              </w:rPr>
+              <w:t xml:space="preserve">8</w:t>
+            </w:r>
+          </w:p>
+        </w:tc>
+        <w:tc>
+          <w:tcPr/>
+          <w:p>
+            <w:pPr>
+              <w:pStyle w:val="Compact"/>
+              <w:jc w:val="left"/>
+            </w:pPr>
+            <w:r>
+              <w:t xml:space="preserve">2.4 × 10</w:t>
+            </w:r>
+            <w:r>
+              <w:rPr>
+                <w:vertAlign w:val="superscript"/>
+              </w:rPr>
+              <w:t xml:space="preserve">6</w:t>
+            </w:r>
+          </w:p>
+        </w:tc>
+      </w:tr>
+      <w:tr>
+        <w:tc>
+          <w:tcPr/>
+          <w:p>
+            <w:pPr>
+              <w:pStyle w:val="Compact"/>
+              <w:jc w:val="left"/>
+            </w:pPr>
+            <w:r>
+              <w:t xml:space="preserve">Final test</w:t>
+            </w:r>
+          </w:p>
+        </w:tc>
+        <w:tc>
+          <w:tcPr/>
+          <w:p>
+            <w:pPr>
+              <w:pStyle w:val="Compact"/>
+              <w:jc w:val="left"/>
+            </w:pPr>
+            <w:r>
+              <w:t xml:space="preserve">General</w:t>
+            </w:r>
+          </w:p>
+        </w:tc>
+        <w:tc>
+          <w:tcPr/>
+          <w:p>
+            <w:pPr>
+              <w:pStyle w:val="Compact"/>
+              <w:jc w:val="left"/>
+            </w:pPr>
+            <w:r>
+              <w:t xml:space="preserve">1.03</w:t>
+            </w:r>
+          </w:p>
+        </w:tc>
+        <w:tc>
+          <w:tcPr/>
+          <w:p>
+            <w:pPr>
+              <w:pStyle w:val="Compact"/>
+              <w:jc w:val="left"/>
+            </w:pPr>
+            <w:r>
+              <w:t xml:space="preserve">0.54</w:t>
+            </w:r>
+          </w:p>
+        </w:tc>
+        <w:tc>
+          <w:tcPr/>
+          <w:p>
+            <w:pPr>
+              <w:pStyle w:val="Compact"/>
+              <w:jc w:val="left"/>
+            </w:pPr>
+            <w:r>
+              <w:t xml:space="preserve">0.30</w:t>
+            </w:r>
+          </w:p>
+        </w:tc>
+      </w:tr>
+      <w:tr>
+        <w:tc>
+          <w:tcPr/>
+          <w:p>
+            <w:pPr>
+              <w:pStyle w:val="Compact"/>
+              <w:jc w:val="left"/>
+            </w:pPr>
+            <w:r>
+              <w:t xml:space="preserve">Final test</w:t>
+            </w:r>
+          </w:p>
+        </w:tc>
+        <w:tc>
+          <w:tcPr/>
+          <w:p>
+            <w:pPr>
+              <w:pStyle w:val="Compact"/>
+              <w:jc w:val="left"/>
+            </w:pPr>
+            <w:r>
+              <w:t xml:space="preserve">Interaction</w:t>
+            </w:r>
+          </w:p>
+        </w:tc>
+        <w:tc>
+          <w:tcPr/>
+          <w:p>
+            <w:pPr>
+              <w:pStyle w:val="Compact"/>
+              <w:jc w:val="left"/>
+            </w:pPr>
+            <w:r>
+              <w:t xml:space="preserve">2.7 × 10</w:t>
+            </w:r>
+            <w:r>
+              <w:rPr>
+                <w:vertAlign w:val="superscript"/>
+              </w:rPr>
+              <w:t xml:space="preserve">10</w:t>
+            </w:r>
+          </w:p>
+        </w:tc>
+        <w:tc>
+          <w:tcPr/>
+          <w:p>
+            <w:pPr>
+              <w:pStyle w:val="Compact"/>
+              <w:jc w:val="left"/>
+            </w:pPr>
+            <w:r>
+              <w:t xml:space="preserve">1.5 × 10</w:t>
+            </w:r>
+            <w:r>
+              <w:rPr>
+                <w:vertAlign w:val="superscript"/>
+              </w:rPr>
+              <w:t xml:space="preserve">10</w:t>
+            </w:r>
+          </w:p>
+        </w:tc>
+        <w:tc>
+          <w:tcPr/>
+          <w:p>
+            <w:pPr>
+              <w:pStyle w:val="Compact"/>
+              <w:jc w:val="left"/>
+            </w:pPr>
+            <w:r>
+              <w:t xml:space="preserve">5.5 × 10</w:t>
+            </w:r>
+            <w:r>
+              <w:rPr>
+                <w:vertAlign w:val="superscript"/>
+              </w:rPr>
+              <w:t xml:space="preserve">9</w:t>
+            </w:r>
+          </w:p>
+        </w:tc>
+      </w:tr>
+      <w:tr>
+        <w:tc>
+          <w:tcPr/>
+          <w:p>
+            <w:pPr>
+              <w:pStyle w:val="Compact"/>
+              <w:jc w:val="left"/>
+            </w:pPr>
+            <w:r>
+              <w:t xml:space="preserve">Selective regression path: μ</w:t>
+            </w:r>
+          </w:p>
+        </w:tc>
+        <w:tc>
+          <w:tcPr/>
+          <w:p>
+            <w:pPr>
+              <w:pStyle w:val="Compact"/>
+              <w:jc w:val="left"/>
+            </w:pPr>
+            <w:r>
+              <w:t xml:space="preserve">Specific</w:t>
+            </w:r>
+          </w:p>
+        </w:tc>
+        <w:tc>
+          <w:tcPr/>
+          <w:p>
+            <w:pPr>
+              <w:pStyle w:val="Compact"/>
+              <w:jc w:val="left"/>
+            </w:pPr>
+            <w:r>
+              <w:t xml:space="preserve">0.13</w:t>
+            </w:r>
+          </w:p>
+        </w:tc>
+        <w:tc>
+          <w:tcPr/>
+          <w:p>
+            <w:pPr>
+              <w:pStyle w:val="Compact"/>
+              <w:jc w:val="left"/>
+            </w:pPr>
+            <w:r>
+              <w:t xml:space="preserve">0.08</w:t>
+            </w:r>
+          </w:p>
+        </w:tc>
+        <w:tc>
+          <w:tcPr/>
+          <w:p>
+            <w:pPr>
+              <w:pStyle w:val="Compact"/>
+              <w:jc w:val="left"/>
+            </w:pPr>
+            <w:r>
+              <w:t xml:space="preserve">0.05</w:t>
+            </w:r>
+          </w:p>
+        </w:tc>
+      </w:tr>
+      <w:tr>
+        <w:tc>
+          <w:tcPr/>
+          <w:p>
+            <w:pPr>
+              <w:pStyle w:val="Compact"/>
+              <w:jc w:val="left"/>
+            </w:pPr>
+            <w:r>
+              <w:t xml:space="preserve">Selective regression path: μ</w:t>
+            </w:r>
+          </w:p>
+        </w:tc>
+        <w:tc>
+          <w:tcPr/>
+          <w:p>
+            <w:pPr>
+              <w:pStyle w:val="Compact"/>
+              <w:jc w:val="left"/>
+            </w:pPr>
+            <w:r>
+              <w:t xml:space="preserve">General</w:t>
+            </w:r>
+          </w:p>
+        </w:tc>
+        <w:tc>
+          <w:tcPr/>
+          <w:p>
+            <w:pPr>
+              <w:pStyle w:val="Compact"/>
+              <w:jc w:val="left"/>
+            </w:pPr>
+            <w:r>
+              <w:t xml:space="preserve">0.14</w:t>
+            </w:r>
+          </w:p>
+        </w:tc>
+        <w:tc>
+          <w:tcPr/>
+          <w:p>
+            <w:pPr>
+              <w:pStyle w:val="Compact"/>
+              <w:jc w:val="left"/>
+            </w:pPr>
+            <w:r>
+              <w:t xml:space="preserve">0.08</w:t>
+            </w:r>
+          </w:p>
+        </w:tc>
+        <w:tc>
+          <w:tcPr/>
+          <w:p>
+            <w:pPr>
+              <w:pStyle w:val="Compact"/>
+              <w:jc w:val="left"/>
+            </w:pPr>
+            <w:r>
+              <w:t xml:space="preserve">0.04</w:t>
+            </w:r>
+          </w:p>
+        </w:tc>
+      </w:tr>
+      <w:tr>
+        <w:tc>
+          <w:tcPr/>
+          <w:p>
+            <w:pPr>
+              <w:pStyle w:val="Compact"/>
+              <w:jc w:val="left"/>
+            </w:pPr>
+            <w:r>
+              <w:t xml:space="preserve">Selective regression path: μ</w:t>
+            </w:r>
+          </w:p>
+        </w:tc>
+        <w:tc>
+          <w:tcPr/>
+          <w:p>
+            <w:pPr>
+              <w:pStyle w:val="Compact"/>
+              <w:jc w:val="left"/>
+            </w:pPr>
+            <w:r>
+              <w:t xml:space="preserve">Interaction</w:t>
+            </w:r>
+          </w:p>
+        </w:tc>
+        <w:tc>
+          <w:tcPr/>
+          <w:p>
+            <w:pPr>
+              <w:pStyle w:val="Compact"/>
+              <w:jc w:val="left"/>
+            </w:pPr>
+            <w:r>
+              <w:t xml:space="preserve">0.15</w:t>
+            </w:r>
+          </w:p>
+        </w:tc>
+        <w:tc>
+          <w:tcPr/>
+          <w:p>
+            <w:pPr>
+              <w:pStyle w:val="Compact"/>
+              <w:jc w:val="left"/>
+            </w:pPr>
+            <w:r>
+              <w:t xml:space="preserve">0.11</w:t>
+            </w:r>
+          </w:p>
+        </w:tc>
+        <w:tc>
+          <w:tcPr/>
+          <w:p>
+            <w:pPr>
+              <w:pStyle w:val="Compact"/>
+              <w:jc w:val="left"/>
+            </w:pPr>
+            <w:r>
+              <w:t xml:space="preserve">0.07</w:t>
+            </w:r>
+          </w:p>
+        </w:tc>
+      </w:tr>
+      <w:tr>
+        <w:tc>
+          <w:tcPr/>
+          <w:p>
+            <w:pPr>
+              <w:pStyle w:val="Compact"/>
+              <w:jc w:val="left"/>
+            </w:pPr>
+            <w:r>
+              <w:t xml:space="preserve">Selective regression path: τ</w:t>
+            </w:r>
+          </w:p>
+        </w:tc>
+        <w:tc>
+          <w:tcPr/>
+          <w:p>
+            <w:pPr>
+              <w:pStyle w:val="Compact"/>
+              <w:jc w:val="left"/>
+            </w:pPr>
+            <w:r>
+              <w:t xml:space="preserve">Specific</w:t>
+            </w:r>
+          </w:p>
+        </w:tc>
+        <w:tc>
+          <w:tcPr/>
+          <w:p>
+            <w:pPr>
+              <w:pStyle w:val="Compact"/>
+              <w:jc w:val="left"/>
+            </w:pPr>
+            <w:r>
+              <w:t xml:space="preserve">1.84</w:t>
+            </w:r>
+          </w:p>
+        </w:tc>
+        <w:tc>
+          <w:tcPr/>
+          <w:p>
+            <w:pPr>
+              <w:pStyle w:val="Compact"/>
+              <w:jc w:val="left"/>
+            </w:pPr>
+            <w:r>
+              <w:t xml:space="preserve">1.25</w:t>
+            </w:r>
+          </w:p>
+        </w:tc>
+        <w:tc>
+          <w:tcPr/>
+          <w:p>
+            <w:pPr>
+              <w:pStyle w:val="Compact"/>
+              <w:jc w:val="left"/>
+            </w:pPr>
+            <w:r>
+              <w:t xml:space="preserve">0.65</w:t>
+            </w:r>
+          </w:p>
+        </w:tc>
+      </w:tr>
+      <w:tr>
+        <w:tc>
+          <w:tcPr/>
+          <w:p>
+            <w:pPr>
+              <w:pStyle w:val="Compact"/>
+              <w:jc w:val="left"/>
+            </w:pPr>
+            <w:r>
+              <w:t xml:space="preserve">Selective regression path: τ</w:t>
+            </w:r>
+          </w:p>
+        </w:tc>
+        <w:tc>
+          <w:tcPr/>
+          <w:p>
+            <w:pPr>
+              <w:pStyle w:val="Compact"/>
+              <w:jc w:val="left"/>
+            </w:pPr>
+            <w:r>
+              <w:t xml:space="preserve">General</w:t>
+            </w:r>
+          </w:p>
+        </w:tc>
+        <w:tc>
+          <w:tcPr/>
+          <w:p>
+            <w:pPr>
+              <w:pStyle w:val="Compact"/>
+              <w:jc w:val="left"/>
+            </w:pPr>
+            <w:r>
+              <w:t xml:space="preserve">0.36</w:t>
+            </w:r>
+          </w:p>
+        </w:tc>
+        <w:tc>
+          <w:tcPr/>
+          <w:p>
+            <w:pPr>
+              <w:pStyle w:val="Compact"/>
+              <w:jc w:val="left"/>
+            </w:pPr>
+            <w:r>
+              <w:t xml:space="preserve">0.22</w:t>
+            </w:r>
+          </w:p>
+        </w:tc>
+        <w:tc>
+          <w:tcPr/>
+          <w:p>
+            <w:pPr>
+              <w:pStyle w:val="Compact"/>
+              <w:jc w:val="left"/>
+            </w:pPr>
+            <w:r>
+              <w:t xml:space="preserve">0.12</w:t>
+            </w:r>
+          </w:p>
+        </w:tc>
+      </w:tr>
+      <w:tr>
+        <w:tc>
+          <w:tcPr/>
+          <w:p>
+            <w:pPr>
+              <w:pStyle w:val="Compact"/>
+              <w:jc w:val="left"/>
+            </w:pPr>
+            <w:r>
+              <w:t xml:space="preserve">Selective regression path: τ</w:t>
+            </w:r>
+          </w:p>
+        </w:tc>
+        <w:tc>
+          <w:tcPr/>
+          <w:p>
+            <w:pPr>
+              <w:pStyle w:val="Compact"/>
+              <w:jc w:val="left"/>
+            </w:pPr>
+            <w:r>
+              <w:t xml:space="preserve">Interaction</w:t>
+            </w:r>
+          </w:p>
+        </w:tc>
+        <w:tc>
+          <w:tcPr/>
+          <w:p>
+            <w:pPr>
+              <w:pStyle w:val="Compact"/>
+              <w:jc w:val="left"/>
+            </w:pPr>
+            <w:r>
+              <w:t xml:space="preserve">2.25</w:t>
+            </w:r>
+          </w:p>
+        </w:tc>
+        <w:tc>
+          <w:tcPr/>
+          <w:p>
+            <w:pPr>
+              <w:pStyle w:val="Compact"/>
+              <w:jc w:val="left"/>
+            </w:pPr>
+            <w:r>
+              <w:t xml:space="preserve">1.68</w:t>
+            </w:r>
+          </w:p>
+        </w:tc>
+        <w:tc>
+          <w:tcPr/>
+          <w:p>
+            <w:pPr>
+              <w:pStyle w:val="Compact"/>
+              <w:jc w:val="left"/>
+            </w:pPr>
+            <w:r>
+              <w:t xml:space="preserve">1.06</w:t>
+            </w:r>
+          </w:p>
+        </w:tc>
+      </w:tr>
+      <w:tr>
+        <w:tc>
+          <w:tcPr/>
+          <w:p>
+            <w:pPr>
+              <w:pStyle w:val="Compact"/>
+              <w:jc w:val="left"/>
+            </w:pPr>
+            <w:r>
+              <w:t xml:space="preserve">Total gaze: μ</w:t>
+            </w:r>
+          </w:p>
+        </w:tc>
+        <w:tc>
+          <w:tcPr/>
+          <w:p>
+            <w:pPr>
+              <w:pStyle w:val="Compact"/>
+              <w:jc w:val="left"/>
+            </w:pPr>
+            <w:r>
+              <w:t xml:space="preserve">Specific</w:t>
+            </w:r>
+          </w:p>
+        </w:tc>
+        <w:tc>
+          <w:tcPr/>
+          <w:p>
+            <w:pPr>
+              <w:pStyle w:val="Compact"/>
+              <w:jc w:val="left"/>
+            </w:pPr>
+            <w:r>
+              <w:t xml:space="preserve">0.13</w:t>
+            </w:r>
+          </w:p>
+        </w:tc>
+        <w:tc>
+          <w:tcPr/>
+          <w:p>
+            <w:pPr>
+              <w:pStyle w:val="Compact"/>
+              <w:jc w:val="left"/>
+            </w:pPr>
+            <w:r>
+              <w:t xml:space="preserve">0.07</w:t>
+            </w:r>
+          </w:p>
+        </w:tc>
+        <w:tc>
+          <w:tcPr/>
+          <w:p>
+            <w:pPr>
+              <w:pStyle w:val="Compact"/>
+              <w:jc w:val="left"/>
+            </w:pPr>
+            <w:r>
+              <w:t xml:space="preserve">0.04</w:t>
+            </w:r>
+          </w:p>
+        </w:tc>
+      </w:tr>
+      <w:tr>
+        <w:tc>
+          <w:tcPr/>
+          <w:p>
+            <w:pPr>
+              <w:pStyle w:val="Compact"/>
+              <w:jc w:val="left"/>
+            </w:pPr>
+            <w:r>
+              <w:t xml:space="preserve">Total gaze: μ</w:t>
+            </w:r>
+          </w:p>
+        </w:tc>
+        <w:tc>
+          <w:tcPr/>
+          <w:p>
+            <w:pPr>
+              <w:pStyle w:val="Compact"/>
+              <w:jc w:val="left"/>
+            </w:pPr>
+            <w:r>
+              <w:t xml:space="preserve">General</w:t>
+            </w:r>
+          </w:p>
+        </w:tc>
+        <w:tc>
+          <w:tcPr/>
+          <w:p>
+            <w:pPr>
+              <w:pStyle w:val="Compact"/>
+              <w:jc w:val="left"/>
+            </w:pPr>
+            <w:r>
+              <w:t xml:space="preserve">0.11</w:t>
+            </w:r>
+          </w:p>
+        </w:tc>
+        <w:tc>
+          <w:tcPr/>
+          <w:p>
+            <w:pPr>
+              <w:pStyle w:val="Compact"/>
+              <w:jc w:val="left"/>
+            </w:pPr>
+            <w:r>
+              <w:t xml:space="preserve">0.06</w:t>
+            </w:r>
+          </w:p>
+        </w:tc>
+        <w:tc>
+          <w:tcPr/>
+          <w:p>
+            <w:pPr>
+              <w:pStyle w:val="Compact"/>
+              <w:jc w:val="left"/>
+            </w:pPr>
+            <w:r>
+              <w:t xml:space="preserve">0.04</w:t>
+            </w:r>
+          </w:p>
+        </w:tc>
+      </w:tr>
+      <w:tr>
+        <w:tc>
+          <w:tcPr/>
+          <w:p>
+            <w:pPr>
+              <w:pStyle w:val="Compact"/>
+              <w:jc w:val="left"/>
+            </w:pPr>
+            <w:r>
+              <w:t xml:space="preserve">Total gaze: μ</w:t>
+            </w:r>
+          </w:p>
+        </w:tc>
+        <w:tc>
+          <w:tcPr/>
+          <w:p>
+            <w:pPr>
+              <w:pStyle w:val="Compact"/>
+              <w:jc w:val="left"/>
+            </w:pPr>
+            <w:r>
+              <w:t xml:space="preserve">Interaction</w:t>
+            </w:r>
+          </w:p>
+        </w:tc>
+        <w:tc>
+          <w:tcPr/>
+          <w:p>
+            <w:pPr>
+              <w:pStyle w:val="Compact"/>
+              <w:jc w:val="left"/>
+            </w:pPr>
+            <w:r>
+              <w:t xml:space="preserve">0.18</w:t>
+            </w:r>
+          </w:p>
+        </w:tc>
+        <w:tc>
+          <w:tcPr/>
+          <w:p>
+            <w:pPr>
+              <w:pStyle w:val="Compact"/>
+              <w:jc w:val="left"/>
+            </w:pPr>
+            <w:r>
+              <w:t xml:space="preserve">0.11</w:t>
+            </w:r>
+          </w:p>
+        </w:tc>
+        <w:tc>
+          <w:tcPr/>
+          <w:p>
+            <w:pPr>
+              <w:pStyle w:val="Compact"/>
+              <w:jc w:val="left"/>
+            </w:pPr>
+            <w:r>
+              <w:t xml:space="preserve">0.07</w:t>
+            </w:r>
+          </w:p>
+        </w:tc>
+      </w:tr>
+      <w:tr>
+        <w:tc>
+          <w:tcPr/>
+          <w:p>
+            <w:pPr>
+              <w:pStyle w:val="Compact"/>
+              <w:jc w:val="left"/>
+            </w:pPr>
+            <w:r>
+              <w:t xml:space="preserve">Total gaze: τ</w:t>
+            </w:r>
+          </w:p>
+        </w:tc>
+        <w:tc>
+          <w:tcPr/>
+          <w:p>
+            <w:pPr>
+              <w:pStyle w:val="Compact"/>
+              <w:jc w:val="left"/>
+            </w:pPr>
+            <w:r>
+              <w:t xml:space="preserve">Specific</w:t>
+            </w:r>
+          </w:p>
+        </w:tc>
+        <w:tc>
+          <w:tcPr/>
+          <w:p>
+            <w:pPr>
+              <w:pStyle w:val="Compact"/>
+              <w:jc w:val="left"/>
+            </w:pPr>
+            <w:r>
+              <w:t xml:space="preserve">34.64</w:t>
+            </w:r>
+          </w:p>
+        </w:tc>
+        <w:tc>
+          <w:tcPr/>
+          <w:p>
+            <w:pPr>
+              <w:pStyle w:val="Compact"/>
+              <w:jc w:val="left"/>
+            </w:pPr>
+            <w:r>
+              <w:t xml:space="preserve">31.07</w:t>
+            </w:r>
+          </w:p>
+        </w:tc>
+        <w:tc>
+          <w:tcPr/>
+          <w:p>
+            <w:pPr>
+              <w:pStyle w:val="Compact"/>
+              <w:jc w:val="left"/>
+            </w:pPr>
+            <w:r>
+              <w:t xml:space="preserve">18.38</w:t>
+            </w:r>
+          </w:p>
+        </w:tc>
+      </w:tr>
+      <w:tr>
+        <w:tc>
+          <w:tcPr/>
+          <w:p>
+            <w:pPr>
+              <w:pStyle w:val="Compact"/>
+              <w:jc w:val="left"/>
+            </w:pPr>
+            <w:r>
+              <w:t xml:space="preserve">Total gaze: τ</w:t>
+            </w:r>
+          </w:p>
+        </w:tc>
+        <w:tc>
+          <w:tcPr/>
+          <w:p>
+            <w:pPr>
+              <w:pStyle w:val="Compact"/>
+              <w:jc w:val="left"/>
+            </w:pPr>
+            <w:r>
+              <w:t xml:space="preserve">General</w:t>
+            </w:r>
+          </w:p>
+        </w:tc>
+        <w:tc>
+          <w:tcPr/>
+          <w:p>
+            <w:pPr>
+              <w:pStyle w:val="Compact"/>
+              <w:jc w:val="left"/>
+            </w:pPr>
+            <w:r>
+              <w:t xml:space="preserve">0.46</w:t>
+            </w:r>
+          </w:p>
+        </w:tc>
+        <w:tc>
+          <w:tcPr/>
+          <w:p>
+            <w:pPr>
+              <w:pStyle w:val="Compact"/>
+              <w:jc w:val="left"/>
+            </w:pPr>
+            <w:r>
+              <w:t xml:space="preserve">0.27</w:t>
+            </w:r>
+          </w:p>
+        </w:tc>
+        <w:tc>
+          <w:tcPr/>
+          <w:p>
+            <w:pPr>
+              <w:pStyle w:val="Compact"/>
+              <w:jc w:val="left"/>
+            </w:pPr>
+            <w:r>
+              <w:t xml:space="preserve">0.15</w:t>
+            </w:r>
+          </w:p>
+        </w:tc>
+      </w:tr>
+      <w:tr>
+        <w:tc>
+          <w:tcPr/>
+          <w:p>
+            <w:pPr>
+              <w:pStyle w:val="Compact"/>
+              <w:jc w:val="left"/>
+            </w:pPr>
+            <w:r>
+              <w:t xml:space="preserve">Total gaze: τ</w:t>
+            </w:r>
+          </w:p>
+        </w:tc>
+        <w:tc>
+          <w:tcPr/>
+          <w:p>
+            <w:pPr>
+              <w:pStyle w:val="Compact"/>
+              <w:jc w:val="left"/>
+            </w:pPr>
+            <w:r>
+              <w:t xml:space="preserve">Interaction</w:t>
+            </w:r>
+          </w:p>
+        </w:tc>
+        <w:tc>
+          <w:tcPr/>
+          <w:p>
+            <w:pPr>
+              <w:pStyle w:val="Compact"/>
+              <w:jc w:val="left"/>
+            </w:pPr>
+            <w:r>
+              <w:t xml:space="preserve">63.00</w:t>
+            </w:r>
+          </w:p>
+        </w:tc>
+        <w:tc>
+          <w:tcPr/>
+          <w:p>
+            <w:pPr>
+              <w:pStyle w:val="Compact"/>
+              <w:jc w:val="left"/>
+            </w:pPr>
+            <w:r>
+              <w:t xml:space="preserve">109</w:t>
+            </w:r>
+          </w:p>
+        </w:tc>
+        <w:tc>
+          <w:tcPr/>
+          <w:p>
+            <w:pPr>
+              <w:pStyle w:val="Compact"/>
+              <w:jc w:val="left"/>
+            </w:pPr>
+            <w:r>
+              <w:t xml:space="preserve">81.00</w:t>
+            </w:r>
+          </w:p>
+        </w:tc>
+      </w:tr>
+      <w:tr>
+        <w:tc>
+          <w:tcPr/>
+          <w:p>
+            <w:pPr>
+              <w:pStyle w:val="Compact"/>
+              <w:jc w:val="left"/>
+            </w:pPr>
+            <w:r>
+              <w:t xml:space="preserve">Regression-in</w:t>
+            </w:r>
+          </w:p>
+        </w:tc>
+        <w:tc>
+          <w:tcPr/>
+          <w:p>
+            <w:pPr>
+              <w:pStyle w:val="Compact"/>
+              <w:jc w:val="left"/>
+            </w:pPr>
+            <w:r>
+              <w:t xml:space="preserve">Specific</w:t>
+            </w:r>
+          </w:p>
+        </w:tc>
+        <w:tc>
+          <w:tcPr/>
+          <w:p>
+            <w:pPr>
+              <w:pStyle w:val="Compact"/>
+              <w:jc w:val="left"/>
+            </w:pPr>
+            <w:r>
+              <w:t xml:space="preserve">2.64</w:t>
+            </w:r>
+          </w:p>
+        </w:tc>
+        <w:tc>
+          <w:tcPr/>
+          <w:p>
+            <w:pPr>
+              <w:pStyle w:val="Compact"/>
+              <w:jc w:val="left"/>
+            </w:pPr>
+            <w:r>
+              <w:t xml:space="preserve">1.67</w:t>
+            </w:r>
+          </w:p>
+        </w:tc>
+        <w:tc>
+          <w:tcPr/>
+          <w:p>
+            <w:pPr>
+              <w:pStyle w:val="Compact"/>
+              <w:jc w:val="left"/>
+            </w:pPr>
+            <w:r>
+              <w:t xml:space="preserve">0.93</w:t>
+            </w:r>
+          </w:p>
+        </w:tc>
+      </w:tr>
+      <w:tr>
+        <w:tc>
+          <w:tcPr/>
+          <w:p>
+            <w:pPr>
+              <w:pStyle w:val="Compact"/>
+              <w:jc w:val="left"/>
+            </w:pPr>
+            <w:r>
+              <w:t xml:space="preserve">Regression-in</w:t>
+            </w:r>
+          </w:p>
+        </w:tc>
+        <w:tc>
+          <w:tcPr/>
+          <w:p>
+            <w:pPr>
+              <w:pStyle w:val="Compact"/>
+              <w:jc w:val="left"/>
+            </w:pPr>
+            <w:r>
+              <w:t xml:space="preserve">General</w:t>
+            </w:r>
+          </w:p>
+        </w:tc>
+        <w:tc>
+          <w:tcPr/>
+          <w:p>
+            <w:pPr>
+              <w:pStyle w:val="Compact"/>
+              <w:jc w:val="left"/>
+            </w:pPr>
+            <w:r>
+              <w:t xml:space="preserve">0.28</w:t>
+            </w:r>
+          </w:p>
+        </w:tc>
+        <w:tc>
+          <w:tcPr/>
+          <w:p>
+            <w:pPr>
+              <w:pStyle w:val="Compact"/>
+              <w:jc w:val="left"/>
+            </w:pPr>
+            <w:r>
+              <w:t xml:space="preserve">0.16</w:t>
+            </w:r>
+          </w:p>
+        </w:tc>
+        <w:tc>
+          <w:tcPr/>
+          <w:p>
+            <w:pPr>
+              <w:pStyle w:val="Compact"/>
+              <w:jc w:val="left"/>
+            </w:pPr>
+            <w:r>
+              <w:t xml:space="preserve">0.09</w:t>
+            </w:r>
+          </w:p>
+        </w:tc>
+      </w:tr>
+      <w:tr>
+        <w:tc>
+          <w:tcPr/>
+          <w:p>
+            <w:pPr>
+              <w:pStyle w:val="Compact"/>
+              <w:jc w:val="left"/>
+            </w:pPr>
+            <w:r>
+              <w:t xml:space="preserve">Regression-in</w:t>
+            </w:r>
+          </w:p>
+        </w:tc>
+        <w:tc>
+          <w:tcPr/>
+          <w:p>
+            <w:pPr>
+              <w:pStyle w:val="Compact"/>
+              <w:jc w:val="left"/>
+            </w:pPr>
+            <w:r>
+              <w:t xml:space="preserve">Interaction</w:t>
+            </w:r>
+          </w:p>
+        </w:tc>
+        <w:tc>
+          <w:tcPr/>
+          <w:p>
+            <w:pPr>
+              <w:pStyle w:val="Compact"/>
+              <w:jc w:val="left"/>
+            </w:pPr>
+            <w:r>
+              <w:t xml:space="preserve">52.00</w:t>
+            </w:r>
+          </w:p>
+        </w:tc>
+        <w:tc>
+          <w:tcPr/>
+          <w:p>
+            <w:pPr>
+              <w:pStyle w:val="Compact"/>
+              <w:jc w:val="left"/>
+            </w:pPr>
+            <w:r>
+              <w:t xml:space="preserve">63.06</w:t>
+            </w:r>
+          </w:p>
+        </w:tc>
+        <w:tc>
+          <w:tcPr/>
+          <w:p>
+            <w:pPr>
+              <w:pStyle w:val="Compact"/>
+              <w:jc w:val="left"/>
+            </w:pPr>
+            <w:r>
+              <w:t xml:space="preserve">62.39</w:t>
+            </w:r>
+          </w:p>
+        </w:tc>
+      </w:tr>
+      <w:tr>
+        <w:tc>
+          <w:tcPr/>
+          <w:p>
+            <w:pPr>
+              <w:pStyle w:val="Compact"/>
+              <w:jc w:val="left"/>
+            </w:pPr>
+            <w:r>
+              <w:t xml:space="preserve">Re-reading time</w:t>
+            </w:r>
+          </w:p>
+        </w:tc>
+        <w:tc>
+          <w:tcPr/>
+          <w:p>
+            <w:pPr>
+              <w:pStyle w:val="Compact"/>
+              <w:jc w:val="left"/>
+            </w:pPr>
+            <w:r>
+              <w:t xml:space="preserve">Specific</w:t>
+            </w:r>
+          </w:p>
+        </w:tc>
+        <w:tc>
+          <w:tcPr/>
+          <w:p>
+            <w:pPr>
+              <w:pStyle w:val="Compact"/>
+              <w:jc w:val="left"/>
+            </w:pPr>
+            <w:r>
+              <w:t xml:space="preserve">8.64</w:t>
+            </w:r>
+          </w:p>
+        </w:tc>
+        <w:tc>
+          <w:tcPr/>
+          <w:p>
+            <w:pPr>
+              <w:pStyle w:val="Compact"/>
+              <w:jc w:val="left"/>
+            </w:pPr>
+            <w:r>
+              <w:t xml:space="preserve">9.49</w:t>
+            </w:r>
+          </w:p>
+        </w:tc>
+        <w:tc>
+          <w:tcPr/>
+          <w:p>
+            <w:pPr>
+              <w:pStyle w:val="Compact"/>
+              <w:jc w:val="left"/>
+            </w:pPr>
+            <w:r>
+              <w:t xml:space="preserve">5.62</w:t>
+            </w:r>
+          </w:p>
+        </w:tc>
+      </w:tr>
+      <w:tr>
+        <w:tc>
+          <w:tcPr/>
+          <w:p>
+            <w:pPr>
+              <w:pStyle w:val="Compact"/>
+              <w:jc w:val="left"/>
+            </w:pPr>
+            <w:r>
+              <w:t xml:space="preserve">Re-reading time</w:t>
+            </w:r>
+          </w:p>
+        </w:tc>
+        <w:tc>
+          <w:tcPr/>
+          <w:p>
+            <w:pPr>
+              <w:pStyle w:val="Compact"/>
+              <w:jc w:val="left"/>
+            </w:pPr>
+            <w:r>
+              <w:t xml:space="preserve">General</w:t>
+            </w:r>
+          </w:p>
+        </w:tc>
+        <w:tc>
+          <w:tcPr/>
+          <w:p>
+            <w:pPr>
+              <w:pStyle w:val="Compact"/>
+              <w:jc w:val="left"/>
+            </w:pPr>
+            <w:r>
+              <w:t xml:space="preserve">0.28</w:t>
+            </w:r>
+          </w:p>
+        </w:tc>
+        <w:tc>
+          <w:tcPr/>
+          <w:p>
+            <w:pPr>
+              <w:pStyle w:val="Compact"/>
+              <w:jc w:val="left"/>
+            </w:pPr>
+            <w:r>
+              <w:t xml:space="preserve">0.18</w:t>
+            </w:r>
+          </w:p>
+        </w:tc>
+        <w:tc>
+          <w:tcPr/>
+          <w:p>
+            <w:pPr>
+              <w:pStyle w:val="Compact"/>
+              <w:jc w:val="left"/>
+            </w:pPr>
+            <w:r>
+              <w:t xml:space="preserve">0.10</w:t>
+            </w:r>
+          </w:p>
+        </w:tc>
+      </w:tr>
+      <w:tr>
+        <w:tc>
+          <w:tcPr/>
+          <w:p>
+            <w:pPr>
+              <w:pStyle w:val="Compact"/>
+              <w:jc w:val="left"/>
+            </w:pPr>
+            <w:r>
+              <w:t xml:space="preserve">Re-reading time</w:t>
+            </w:r>
+          </w:p>
+        </w:tc>
+        <w:tc>
+          <w:tcPr/>
+          <w:p>
+            <w:pPr>
+              <w:pStyle w:val="Compact"/>
+              <w:jc w:val="left"/>
+            </w:pPr>
+            <w:r>
+              <w:t xml:space="preserve">Interaction</w:t>
+            </w:r>
+          </w:p>
+        </w:tc>
+        <w:tc>
+          <w:tcPr/>
+          <w:p>
+            <w:pPr>
+              <w:pStyle w:val="Compact"/>
+              <w:jc w:val="left"/>
+            </w:pPr>
+            <w:r>
+              <w:t xml:space="preserve">3.26</w:t>
+            </w:r>
+          </w:p>
+        </w:tc>
+        <w:tc>
+          <w:tcPr/>
+          <w:p>
+            <w:pPr>
+              <w:pStyle w:val="Compact"/>
+              <w:jc w:val="left"/>
+            </w:pPr>
+            <w:r>
+              <w:t xml:space="preserve">4.79</w:t>
+            </w:r>
+          </w:p>
+        </w:tc>
+        <w:tc>
+          <w:tcPr/>
+          <w:p>
+            <w:pPr>
+              <w:pStyle w:val="Compact"/>
+              <w:jc w:val="left"/>
+            </w:pPr>
+            <w:r>
+              <w:t xml:space="preserve">4.26</w:t>
+            </w:r>
+          </w:p>
+        </w:tc>
+      </w:tr>
+    </w:tbl>
+    <w:bookmarkEnd w:id="235"/>
+    <w:p>
+      <w:pPr>
+        <w:pStyle w:val="FigureNote"/>
+      </w:pPr>
+      <w:r>
+        <w:rPr>
+          <w:i/>
+          <w:iCs/>
+        </w:rPr>
+        <w:t xml:space="preserve">Note</w:t>
+      </w:r>
+      <w:r>
+        <w:t xml:space="preserve">. Each model was refitted with the standard deviation of every prior on the effects (all comparisons between conditions, including the τ parts of the ex-Gaussian models) multiplied by 0.5 or 2; all other priors and settings were as in the main analysis. Specific = prequestioned − no-prequestion; general = non-prequestioned − no-prequestion (pooled models); interaction = the Group × Topic interaction contrast. BF</w:t>
+      </w:r>
+      <w:r>
+        <w:rPr>
+          <w:vertAlign w:val="subscript"/>
+        </w:rPr>
+        <w:t xml:space="preserve">10</w:t>
+      </w:r>
+      <w:r>
+        <w:t xml:space="preserve"> </w:t>
+      </w:r>
+      <w:r>
+        <w:t xml:space="preserve">&gt; 1 favours a difference and BF</w:t>
+      </w:r>
+      <w:r>
+        <w:rPr>
+          <w:vertAlign w:val="subscript"/>
+        </w:rPr>
+        <w:t xml:space="preserve">10</w:t>
+      </w:r>
+      <w:r>
+        <w:t xml:space="preserve"> </w:t>
+      </w:r>
+      <w:r>
+        <w:t xml:space="preserve">&lt; 1 no difference (BF</w:t>
+      </w:r>
+      <w:r>
+        <w:rPr>
+          <w:vertAlign w:val="subscript"/>
+        </w:rPr>
+        <w:t xml:space="preserve">01</w:t>
+      </w:r>
+      <w:r>
+        <w:t xml:space="preserve"> </w:t>
+      </w:r>
+      <w:r>
+        <w:t xml:space="preserve">= 1/BF</w:t>
+      </w:r>
+      <w:r>
+        <w:rPr>
+          <w:vertAlign w:val="subscript"/>
+        </w:rPr>
+        <w:t xml:space="preserve">10</w:t>
+      </w:r>
+      <w:r>
+        <w:t xml:space="preserve">). Narrower priors favour a difference more, and wider priors less, when the estimate is close to 0.</w:t>
+      </w:r>
+    </w:p>
     <w:sectPr>
       <w:lnNumType w:countBy="1" w:restart="continuous"/>
     </w:sectPr>
-    <w:bookmarkEnd w:id="234"/>
+    <w:bookmarkEnd w:id="236"/>
     <w:sectPr>
       <w:headerReference r:id="rId8" w:type="even"/>
       <w:headerReference r:id="rId9" w:type="default"/>

</xml_diff>

<commit_message>
Report observed reading times and the ex-Gaussian mean (mu + tau) and SD
Co-Authored-By: Claude Opus 5.5 <noreply@anthropic.com>
</commit_message>
<xml_diff>
--- a/manuscript/manuscript.docx
+++ b/manuscript/manuscript.docx
@@ -3988,7 +3988,7 @@
         <w:t xml:space="preserve">)</w:t>
       </w:r>
       <w:r>
-        <w:t xml:space="preserve">), which describes a duration as the sum of a Gaussian component, whose mean μ reflects typical reading time, and an exponential component, whose mean τ reflects the tail of unusually long readings. The fixed and random effects applied to both μ and τ, and σ had by-participant random intercepts. The preregistered first-pass duration, from first entering a sentence until first leaving it, could not be described by any of the distributions we considered (ex-Gaussian, Gamma, lognormal), because it mixes two kinds of first pass. About half of first passes, in all three conditions, were cut short after a few fixations by a brief return to the preceding line, so the distribution had two modes: interrupted first passes of a few hundred milliseconds and complete first readings of several seconds. First-pass reading was therefore measured as selective regression-path duration [also called right-bounded reading time;</w:t>
+        <w:t xml:space="preserve">), which describes a duration as the sum of a Gaussian component, whose mean μ reflects typical reading time, and an exponential component, whose mean τ reflects the tail of unusually long readings. The mean of an ex-Gaussian distribution is μ + τ and its standard deviation is √(σ² + τ²), where σ is the standard deviation of the Gaussian component, so μ and τ are components of reading time rather than reading times themselves. The fixed and random effects applied to both μ and τ, and σ had by-participant random intercepts. The preregistered first-pass duration, from first entering a sentence until first leaving it, could not be described by any of the distributions we considered (ex-Gaussian, Gamma, lognormal), because it mixes two kinds of first pass. About half of first passes, in all three conditions, were cut short after a few fixations by a brief return to the preceding line, so the distribution had two modes: interrupted first passes of a few hundred milliseconds and complete first readings of several seconds. First-pass reading was therefore measured as selective regression-path duration [also called right-bounded reading time;</w:t>
       </w:r>
       <w:r>
         <w:t xml:space="preserve"> </w:t>
@@ -4813,7 +4813,33 @@
         <w:pStyle w:val="FirstParagraph"/>
       </w:pPr>
       <w:r>
-        <w:t xml:space="preserve">We first compare prequestioned and non-prequestioned sentences with the same sentences read by no-prequestion readers (</w:t>
+        <w:t xml:space="preserve">Without prequestions, readers spent on average 249 ms per word on a target sentence in total (</w:t>
+      </w:r>
+      <w:r>
+        <w:rPr>
+          <w:i/>
+          <w:iCs/>
+        </w:rPr>
+        <w:t xml:space="preserve">SD</w:t>
+      </w:r>
+      <w:r>
+        <w:t xml:space="preserve"> </w:t>
+      </w:r>
+      <w:r>
+        <w:t xml:space="preserve">= 136; about 241 words per minute), 215 ms per word (</w:t>
+      </w:r>
+      <w:r>
+        <w:rPr>
+          <w:i/>
+          <w:iCs/>
+        </w:rPr>
+        <w:t xml:space="preserve">SD</w:t>
+      </w:r>
+      <w:r>
+        <w:t xml:space="preserve"> </w:t>
+      </w:r>
+      <w:r>
+        <w:t xml:space="preserve">= 109) of it in first-pass reading (selective regression-path duration). The ex-Gaussian estimates below divide such reading times into a typical part (μ) and a tail (τ), which sum to the mean. We first compare prequestioned and non-prequestioned sentences with the same sentences read by no-prequestion readers (</w:t>
       </w:r>
       <w:hyperlink w:anchor="tbl-status">
         <w:r>
@@ -5987,7 +6013,7 @@
         <w:t xml:space="preserve">Note</w:t>
       </w:r>
       <w:r>
-        <w:t xml:space="preserve">. Posterior distributions of the model-estimated means, averaged over the observed sample. Left: the status models, pooled over the two prequestion groups and both topics (prequestioned, non-prequestioned, and no-prequestion sentences). Other panels: the Group × Topic models, for the Polio and TB sentences in the Polio, TB, and no-prequestion groups; colours give the status of the sentences for the readers in that group. μ and τ are the Gaussian mean (typical reading time) and the tail mean (unusually long readings) of the ex-Gaussian models of selective regression-path duration (first-pass reading) and total gaze duration. Durations are in ms per word; regressions-in are the percentage of sentences returned to from later text; re-reading time is for sentences that were re-read. Preq. = prequestioned; non-preq. = non-prequestioned; no-preq. = no-prequestion. Points are posterior means; thick and thin bars are 66% and 95% credible intervals.</w:t>
+        <w:t xml:space="preserve">. Posterior distributions of the model-estimated means, averaged over the observed sample. For the ex-Gaussian measures, μ and τ are shown separately; a mean reading time is μ + τ. Left: the status models, pooled over the two prequestion groups and both topics (prequestioned, non-prequestioned, and no-prequestion sentences). Other panels: the Group × Topic models, for the Polio and TB sentences in the Polio, TB, and no-prequestion groups; colours give the status of the sentences for the readers in that group. μ and τ are the Gaussian mean (typical reading time) and the tail mean (unusually long readings) of the ex-Gaussian models of selective regression-path duration (first-pass reading) and total gaze duration. Durations are in ms per word; regressions-in are the percentage of sentences returned to from later text; re-reading time is for sentences that were re-read. Preq. = prequestioned; non-preq. = non-prequestioned; no-preq. = no-prequestion. Points are posterior means; thick and thin bars are 66% and 95% credible intervals.</w:t>
       </w:r>
     </w:p>
     <w:bookmarkEnd w:id="68"/>

</xml_diff>